<commit_message>
PDI: separa sugestões por origem (BUD → Sistema → Outras)
PdiItem passa a gravar a LOB de origem (lobId) de cada sugestão
automática. O ecrã de PDI cruza esse lobId com os objetivos de LOB
atuais (sistema/BUD) para agrupar os itens, por esta ordem: recomendadas
pelo BUD, sugeridas pelo sistema, e restantes competências fora dos
objetivos de LOB atuais (itens manuais, ou cuja LOB deixou de ser
objetivo). A classificação é sempre derivada ao vivo, nunca guardada
como texto.

Co-Authored-By: Claude Sonnet 5 <noreply@anthropic.com>
Claude-Session: https://claude.ai/code/session_019jF459S2ehSho3txqSUTg1
</commit_message>
<xml_diff>
--- a/gap-analysis-competencias/docs/DOCUMENTO_FUNCIONAL.docx
+++ b/gap-analysis-competencias/docs/DOCUMENTO_FUNCIONAL.docx
@@ -1263,15 +1263,61 @@
         <w:spacing w:after="140"/>
       </w:pPr>
       <w:r>
-        <w:t xml:space="preserve">(sem duplicar itens já existentes). Itens podem ser adicionados/eliminados manualmente e o estado</w:t>
-      </w:r>
-    </w:p>
-    <w:p>
-      <w:pPr>
-        <w:spacing w:after="140"/>
-      </w:pPr>
-      <w:r>
-        <w:t xml:space="preserve">acompanhado (Pendente/Em curso/Concluído).</w:t>
+        <w:t xml:space="preserve">(sem duplicar itens já existentes). No ecrã, os itens aparecem separados em 3 grupos, por esta</w:t>
+      </w:r>
+    </w:p>
+    <w:p>
+      <w:pPr>
+        <w:spacing w:after="140"/>
+      </w:pPr>
+      <w:r>
+        <w:t xml:space="preserve">ordem: </w:t>
+      </w:r>
+      <w:r>
+        <w:rPr>
+          <w:b/>
+          <w:bCs/>
+        </w:rPr>
+        <w:t xml:space="preserve">Recomendadas pelo BUD</w:t>
+      </w:r>
+      <w:r>
+        <w:t xml:space="preserve">, </w:t>
+      </w:r>
+      <w:r>
+        <w:rPr>
+          <w:b/>
+          <w:bCs/>
+        </w:rPr>
+        <w:t xml:space="preserve">Sugeridas pelo sistema</w:t>
+      </w:r>
+      <w:r>
+        <w:t xml:space="preserve">, e </w:t>
+      </w:r>
+      <w:r>
+        <w:rPr>
+          <w:b/>
+          <w:bCs/>
+        </w:rPr>
+        <w:t xml:space="preserve">Outras competências</w:t>
+      </w:r>
+      <w:r>
+        <w:t xml:space="preserve"> (itens</w:t>
+      </w:r>
+    </w:p>
+    <w:p>
+      <w:pPr>
+        <w:spacing w:after="140"/>
+      </w:pPr>
+      <w:r>
+        <w:t xml:space="preserve">adicionados manualmente, ou cuja LOB de origem deixou de ser um objetivo atual). Itens podem ser</w:t>
+      </w:r>
+    </w:p>
+    <w:p>
+      <w:pPr>
+        <w:spacing w:after="140"/>
+      </w:pPr>
+      <w:r>
+        <w:t xml:space="preserve">adicionados/eliminados manualmente e o estado acompanhado (Pendente/Em curso/Concluído).</w:t>
       </w:r>
     </w:p>
     <w:p>

</xml_diff>

<commit_message>
Ficha do colaborador: layout de LOBs, PDI por LOB e Projetos
- Quadro de LOBs mais estreito, lado a lado com o Detalhe da LOB; por
  omissão mostra só as LOBs da área do colaborador, com opção de ver
  todas.
- PDI: dentro de "Recomendadas pelo BUD" e "Sugeridas pelo sistema", os
  itens passam a estar sub-agrupados pela LOB de origem.
- Nova via para subir de nível numa competência: Projetos (catálogo) têm
  vertentes ligadas a uma competência cada; registar participação exige
  escolher pelo menos uma vertente (indicando quais competências vão ser
  desenvolvidas) e sobe sempre +1 nível por vertente, capado ao nível
  máximo da escala. Um colaborador só participa num dado projeto uma
  vez. As vertentes disponíveis aparecem como sugestão ao lado de
  Formações/Certificações no Detalhe da LOB.

Co-Authored-By: Claude Sonnet 5 <noreply@anthropic.com>
Claude-Session: https://claude.ai/code/session_019jF459S2ehSho3txqSUTg1
</commit_message>
<xml_diff>
--- a/gap-analysis-competencias/docs/DOCUMENTO_FUNCIONAL.docx
+++ b/gap-analysis-competencias/docs/DOCUMENTO_FUNCIONAL.docx
@@ -792,7 +792,41 @@
         <w:spacing w:after="140"/>
       </w:pPr>
       <w:r>
-        <w:t xml:space="preserve">   radar da skill matrix, "Próxima LOB" (escolha manual), </w:t>
+        <w:t xml:space="preserve">   radar da skill matrix, "Próxima LOB" (escolha manual), quadro de LOBs (por omissão só da área</w:t>
+      </w:r>
+    </w:p>
+    <w:p>
+      <w:pPr>
+        <w:spacing w:after="140"/>
+      </w:pPr>
+      <w:r>
+        <w:t xml:space="preserve">   do colaborador, com opção de ver todas) lado a lado com o Detalhe da LOB selecionada —</w:t>
+      </w:r>
+    </w:p>
+    <w:p>
+      <w:pPr>
+        <w:spacing w:after="140"/>
+      </w:pPr>
+      <w:r>
+        <w:t xml:space="preserve">   competências/certificações em falta com sugestões de Formação, Certificação e </w:t>
+      </w:r>
+      <w:r>
+        <w:rPr>
+          <w:b/>
+          <w:bCs/>
+        </w:rPr>
+        <w:t xml:space="preserve">Projetos</w:t>
+      </w:r>
+      <w:r>
+        <w:t xml:space="preserve"> (ver</w:t>
+      </w:r>
+    </w:p>
+    <w:p>
+      <w:pPr>
+        <w:spacing w:after="140"/>
+      </w:pPr>
+      <w:r>
+        <w:t xml:space="preserve">   §4.3-A), </w:t>
       </w:r>
       <w:r>
         <w:rPr>
@@ -802,23 +836,15 @@
         <w:t xml:space="preserve">Objetivos de LOB</w:t>
       </w:r>
       <w:r>
-        <w:t xml:space="preserve"> (sugestões</w:t>
-      </w:r>
-    </w:p>
-    <w:p>
-      <w:pPr>
-        <w:spacing w:after="140"/>
-      </w:pPr>
-      <w:r>
-        <w:t xml:space="preserve">   automáticas + recomendações do BUD), Plano de Desenvolvimento Individual, botão</w:t>
-      </w:r>
-    </w:p>
-    <w:p>
-      <w:pPr>
-        <w:spacing w:after="140"/>
-      </w:pPr>
-      <w:r>
-        <w:t xml:space="preserve">   imprimir/exportar PDF.</w:t>
+        <w:t xml:space="preserve"> (sugestões automáticas + recomendações do BUD), Plano de</w:t>
+      </w:r>
+    </w:p>
+    <w:p>
+      <w:pPr>
+        <w:spacing w:after="140"/>
+      </w:pPr>
+      <w:r>
+        <w:t xml:space="preserve">   Desenvolvimento Individual, botão imprimir/exportar PDF.</w:t>
       </w:r>
     </w:p>
     <w:p>
@@ -1309,7 +1335,15 @@
         <w:spacing w:after="140"/>
       </w:pPr>
       <w:r>
-        <w:t xml:space="preserve">adicionados manualmente, ou cuja LOB de origem deixou de ser um objetivo atual). Itens podem ser</w:t>
+        <w:t xml:space="preserve">adicionados manualmente, ou cuja LOB de origem deixou de ser um objetivo atual); dentro dos dois</w:t>
+      </w:r>
+    </w:p>
+    <w:p>
+      <w:pPr>
+        <w:spacing w:after="140"/>
+      </w:pPr>
+      <w:r>
+        <w:t xml:space="preserve">primeiros grupos, os itens aparecem ainda sub-agrupados pela LOB de origem. Itens podem ser</w:t>
       </w:r>
     </w:p>
     <w:p>
@@ -1318,6 +1352,127 @@
       </w:pPr>
       <w:r>
         <w:t xml:space="preserve">adicionados/eliminados manualmente e o estado acompanhado (Pendente/Em curso/Concluído).</w:t>
+      </w:r>
+    </w:p>
+    <w:p>
+      <w:pPr>
+        <w:pStyle w:val="Heading2"/>
+        <w:spacing w:after="100" w:before="240"/>
+      </w:pPr>
+      <w:r>
+        <w:t xml:space="preserve">4.3-A Projetos — via alternativa para subir de nível</w:t>
+      </w:r>
+    </w:p>
+    <w:p>
+      <w:pPr>
+        <w:spacing w:after="140"/>
+      </w:pPr>
+      <w:r>
+        <w:t xml:space="preserve">Além de Formações e Certificações, o sistema sugere participação em </w:t>
+      </w:r>
+      <w:r>
+        <w:rPr>
+          <w:b/>
+          <w:bCs/>
+        </w:rPr>
+        <w:t xml:space="preserve">Projetos</w:t>
+      </w:r>
+      <w:r>
+        <w:t xml:space="preserve"> para colmatar uma</w:t>
+      </w:r>
+    </w:p>
+    <w:p>
+      <w:pPr>
+        <w:spacing w:after="140"/>
+      </w:pPr>
+      <w:r>
+        <w:t xml:space="preserve">lacuna de competência. Um Projeto tem uma ou mais </w:t>
+      </w:r>
+      <w:r>
+        <w:rPr>
+          <w:b/>
+          <w:bCs/>
+        </w:rPr>
+        <w:t xml:space="preserve">Vertentes</w:t>
+      </w:r>
+      <w:r>
+        <w:t xml:space="preserve">, cada uma ligada a uma competência</w:t>
+      </w:r>
+    </w:p>
+    <w:p>
+      <w:pPr>
+        <w:spacing w:after="140"/>
+      </w:pPr>
+      <w:r>
+        <w:t xml:space="preserve">específica. Ao registar a participação de um colaborador num projeto, escolhe-se em quais</w:t>
+      </w:r>
+    </w:p>
+    <w:p>
+      <w:pPr>
+        <w:spacing w:after="140"/>
+      </w:pPr>
+      <w:r>
+        <w:t xml:space="preserve">vertentes ele participou (no mínimo uma — é assim que se indica quais competências vão ser</w:t>
+      </w:r>
+    </w:p>
+    <w:p>
+      <w:pPr>
+        <w:spacing w:after="140"/>
+      </w:pPr>
+      <w:r>
+        <w:t xml:space="preserve">desenvolvidas); cada vertente escolhida sobe sempre </w:t>
+      </w:r>
+      <w:r>
+        <w:rPr>
+          <w:b/>
+          <w:bCs/>
+        </w:rPr>
+        <w:t xml:space="preserve">+1 nível</w:t>
+      </w:r>
+      <w:r>
+        <w:t xml:space="preserve"> na sua competência, capado ao</w:t>
+      </w:r>
+    </w:p>
+    <w:p>
+      <w:pPr>
+        <w:spacing w:after="140"/>
+      </w:pPr>
+      <w:r>
+        <w:t xml:space="preserve">nível máximo da escala — ao contrário de Formação/Certificação, que levam a um nível fixo. Um</w:t>
+      </w:r>
+    </w:p>
+    <w:p>
+      <w:pPr>
+        <w:spacing w:after="140"/>
+      </w:pPr>
+      <w:r>
+        <w:t xml:space="preserve">colaborador só participa num dado projeto </w:t>
+      </w:r>
+      <w:r>
+        <w:rPr>
+          <w:b/>
+          <w:bCs/>
+        </w:rPr>
+        <w:t xml:space="preserve">uma única vez</w:t>
+      </w:r>
+      <w:r>
+        <w:t xml:space="preserve">; depois de registada a participação,</w:t>
+      </w:r>
+    </w:p>
+    <w:p>
+      <w:pPr>
+        <w:spacing w:after="140"/>
+      </w:pPr>
+      <w:r>
+        <w:t xml:space="preserve">esse projeto deixa de aparecer como sugestão. As sugestões de projeto aparecem junto de cada</w:t>
+      </w:r>
+    </w:p>
+    <w:p>
+      <w:pPr>
+        <w:spacing w:after="140"/>
+      </w:pPr>
+      <w:r>
+        <w:t xml:space="preserve">competência em falta no Detalhe da LOB, ao lado das de Formação e Certificação.</w:t>
       </w:r>
     </w:p>
     <w:p>

</xml_diff>